<commit_message>
Tighten JD spacing to guarantee single-page fit
Co-Authored-By: Claude Opus 5.5 <noreply@anthropic.com>
Claude-Session: https://claude.ai/code/session_01DRS427TmedrgNWiwES9UMX
</commit_message>
<xml_diff>
--- a/JD_Product_Business_Operations_Analyst.docx
+++ b/JD_Product_Business_Operations_Analyst.docx
@@ -160,27 +160,27 @@
         <w:pBdr>
           <w:bottom w:val="single" w:color="808080" w:sz="6" w:space="1"/>
         </w:pBdr>
-        <w:spacing w:after="360" w:before="360"/>
-      </w:pPr>
-    </w:p>
-    <w:p>
-      <w:pPr>
-        <w:spacing w:after="240"/>
+        <w:spacing w:after="200" w:before="160"/>
+      </w:pPr>
+    </w:p>
+    <w:p>
+      <w:pPr>
+        <w:spacing w:after="140"/>
       </w:pPr>
       <w:r>
         <w:rPr>
           <w:rFonts w:ascii="Times New Roman" w:cs="Times New Roman" w:eastAsia="Times New Roman" w:hAnsi="Times New Roman"/>
           <w:b/>
           <w:bCs/>
-          <w:sz w:val="30"/>
-          <w:szCs w:val="30"/>
+          <w:sz w:val="28"/>
+          <w:szCs w:val="28"/>
         </w:rPr>
         <w:t xml:space="preserve">Job Description: Product &amp; Business Operations Analyst</w:t>
       </w:r>
     </w:p>
     <w:p>
       <w:pPr>
-        <w:spacing w:after="60"/>
+        <w:spacing w:after="30"/>
       </w:pPr>
       <w:r>
         <w:rPr>
@@ -203,7 +203,7 @@
     </w:p>
     <w:p>
       <w:pPr>
-        <w:spacing w:after="60"/>
+        <w:spacing w:after="30"/>
       </w:pPr>
       <w:r>
         <w:rPr>
@@ -226,7 +226,7 @@
     </w:p>
     <w:p>
       <w:pPr>
-        <w:spacing w:after="60"/>
+        <w:spacing w:after="30"/>
       </w:pPr>
       <w:r>
         <w:rPr>
@@ -249,7 +249,7 @@
     </w:p>
     <w:p>
       <w:pPr>
-        <w:spacing w:after="60"/>
+        <w:spacing w:after="30"/>
       </w:pPr>
       <w:r>
         <w:rPr>
@@ -272,22 +272,22 @@
     </w:p>
     <w:p>
       <w:pPr>
-        <w:spacing w:after="80" w:before="240"/>
+        <w:spacing w:after="60" w:before="160"/>
       </w:pPr>
       <w:r>
         <w:rPr>
           <w:rFonts w:ascii="Times New Roman" w:cs="Times New Roman" w:eastAsia="Times New Roman" w:hAnsi="Times New Roman"/>
           <w:b/>
           <w:bCs/>
-          <w:sz w:val="26"/>
-          <w:szCs w:val="26"/>
+          <w:sz w:val="24"/>
+          <w:szCs w:val="24"/>
         </w:rPr>
         <w:t xml:space="preserve">About Icestasy</w:t>
       </w:r>
     </w:p>
     <w:p>
       <w:pPr>
-        <w:spacing w:after="80" w:line="252"/>
+        <w:spacing w:after="60" w:line="240"/>
       </w:pPr>
       <w:r>
         <w:rPr>
@@ -300,22 +300,22 @@
     </w:p>
     <w:p>
       <w:pPr>
-        <w:spacing w:after="80" w:before="240"/>
+        <w:spacing w:after="60" w:before="160"/>
       </w:pPr>
       <w:r>
         <w:rPr>
           <w:rFonts w:ascii="Times New Roman" w:cs="Times New Roman" w:eastAsia="Times New Roman" w:hAnsi="Times New Roman"/>
           <w:b/>
           <w:bCs/>
-          <w:sz w:val="26"/>
-          <w:szCs w:val="26"/>
+          <w:sz w:val="24"/>
+          <w:szCs w:val="24"/>
         </w:rPr>
         <w:t xml:space="preserve">Role Summary</w:t>
       </w:r>
     </w:p>
     <w:p>
       <w:pPr>
-        <w:spacing w:after="80" w:line="252"/>
+        <w:spacing w:after="60" w:line="240"/>
       </w:pPr>
       <w:r>
         <w:rPr>
@@ -328,15 +328,15 @@
     </w:p>
     <w:p>
       <w:pPr>
-        <w:spacing w:after="80" w:before="240"/>
+        <w:spacing w:after="60" w:before="160"/>
       </w:pPr>
       <w:r>
         <w:rPr>
           <w:rFonts w:ascii="Times New Roman" w:cs="Times New Roman" w:eastAsia="Times New Roman" w:hAnsi="Times New Roman"/>
           <w:b/>
           <w:bCs/>
-          <w:sz w:val="26"/>
-          <w:szCs w:val="26"/>
+          <w:sz w:val="24"/>
+          <w:szCs w:val="24"/>
         </w:rPr>
         <w:t xml:space="preserve">Key Responsibilities</w:t>
       </w:r>
@@ -348,7 +348,7 @@
           <w:ilvl w:val="0"/>
           <w:numId w:val="2"/>
         </w:numPr>
-        <w:spacing w:after="60"/>
+        <w:spacing w:after="30"/>
       </w:pPr>
       <w:r>
         <w:rPr>
@@ -366,7 +366,7 @@
           <w:ilvl w:val="0"/>
           <w:numId w:val="2"/>
         </w:numPr>
-        <w:spacing w:after="60"/>
+        <w:spacing w:after="30"/>
       </w:pPr>
       <w:r>
         <w:rPr>
@@ -384,7 +384,7 @@
           <w:ilvl w:val="0"/>
           <w:numId w:val="2"/>
         </w:numPr>
-        <w:spacing w:after="60"/>
+        <w:spacing w:after="30"/>
       </w:pPr>
       <w:r>
         <w:rPr>
@@ -402,7 +402,7 @@
           <w:ilvl w:val="0"/>
           <w:numId w:val="2"/>
         </w:numPr>
-        <w:spacing w:after="60"/>
+        <w:spacing w:after="30"/>
       </w:pPr>
       <w:r>
         <w:rPr>
@@ -420,7 +420,7 @@
           <w:ilvl w:val="0"/>
           <w:numId w:val="2"/>
         </w:numPr>
-        <w:spacing w:after="60"/>
+        <w:spacing w:after="30"/>
       </w:pPr>
       <w:r>
         <w:rPr>
@@ -438,7 +438,7 @@
           <w:ilvl w:val="0"/>
           <w:numId w:val="2"/>
         </w:numPr>
-        <w:spacing w:after="60"/>
+        <w:spacing w:after="30"/>
       </w:pPr>
       <w:r>
         <w:rPr>
@@ -451,15 +451,15 @@
     </w:p>
     <w:p>
       <w:pPr>
-        <w:spacing w:after="80" w:before="240"/>
+        <w:spacing w:after="60" w:before="160"/>
       </w:pPr>
       <w:r>
         <w:rPr>
           <w:rFonts w:ascii="Times New Roman" w:cs="Times New Roman" w:eastAsia="Times New Roman" w:hAnsi="Times New Roman"/>
           <w:b/>
           <w:bCs/>
-          <w:sz w:val="26"/>
-          <w:szCs w:val="26"/>
+          <w:sz w:val="24"/>
+          <w:szCs w:val="24"/>
         </w:rPr>
         <w:t xml:space="preserve">Key Skills You’ll Bring</w:t>
       </w:r>
@@ -471,7 +471,7 @@
           <w:ilvl w:val="0"/>
           <w:numId w:val="2"/>
         </w:numPr>
-        <w:spacing w:after="60"/>
+        <w:spacing w:after="30"/>
       </w:pPr>
       <w:r>
         <w:rPr>
@@ -489,7 +489,7 @@
           <w:ilvl w:val="0"/>
           <w:numId w:val="2"/>
         </w:numPr>
-        <w:spacing w:after="60"/>
+        <w:spacing w:after="30"/>
       </w:pPr>
       <w:r>
         <w:rPr>
@@ -507,7 +507,7 @@
           <w:ilvl w:val="0"/>
           <w:numId w:val="2"/>
         </w:numPr>
-        <w:spacing w:after="60"/>
+        <w:spacing w:after="30"/>
       </w:pPr>
       <w:r>
         <w:rPr>
@@ -525,7 +525,7 @@
           <w:ilvl w:val="0"/>
           <w:numId w:val="2"/>
         </w:numPr>
-        <w:spacing w:after="60"/>
+        <w:spacing w:after="30"/>
       </w:pPr>
       <w:r>
         <w:rPr>
@@ -543,7 +543,7 @@
           <w:ilvl w:val="0"/>
           <w:numId w:val="2"/>
         </w:numPr>
-        <w:spacing w:after="60"/>
+        <w:spacing w:after="30"/>
       </w:pPr>
       <w:r>
         <w:rPr>
@@ -556,7 +556,7 @@
     </w:p>
     <w:sectPr>
       <w:pgSz w:w="11906" w:h="16838" w:orient="portrait"/>
-      <w:pgMar w:top="1080" w:right="1080" w:bottom="1080" w:left="1080" w:header="708" w:footer="708" w:gutter="0"/>
+      <w:pgMar w:top="720" w:right="1080" w:bottom="720" w:left="1080" w:header="708" w:footer="708" w:gutter="0"/>
       <w:pgNumType/>
       <w:docGrid w:linePitch="360"/>
     </w:sectPr>

</xml_diff>

<commit_message>
Rewrite JD key skills to be role-specific
Co-Authored-By: Claude Opus 5.5 <noreply@anthropic.com>
Claude-Session: https://claude.ai/code/session_01DRS427TmedrgNWiwES9UMX
</commit_message>
<xml_diff>
--- a/JD_Product_Business_Operations_Analyst.docx
+++ b/JD_Product_Business_Operations_Analyst.docx
@@ -479,43 +479,61 @@
           <w:sz w:val="22"/>
           <w:szCs w:val="22"/>
         </w:rPr>
-        <w:t xml:space="preserve">Structured problem solving, with the ability to turn a vague problem into a clear, working solution</w:t>
-      </w:r>
-    </w:p>
-    <w:p>
-      <w:pPr>
-        <w:pStyle w:val="ListParagraph"/>
-        <w:numPr>
-          <w:ilvl w:val="0"/>
-          <w:numId w:val="2"/>
-        </w:numPr>
-        <w:spacing w:after="30"/>
-      </w:pPr>
-      <w:r>
-        <w:rPr>
-          <w:rFonts w:ascii="Times New Roman" w:cs="Times New Roman" w:eastAsia="Times New Roman" w:hAnsi="Times New Roman"/>
-          <w:sz w:val="22"/>
-          <w:szCs w:val="22"/>
-        </w:rPr>
-        <w:t xml:space="preserve">Working knowledge of cost structures, unit economics, margins, and P&amp;L</w:t>
-      </w:r>
-    </w:p>
-    <w:p>
-      <w:pPr>
-        <w:pStyle w:val="ListParagraph"/>
-        <w:numPr>
-          <w:ilvl w:val="0"/>
-          <w:numId w:val="2"/>
-        </w:numPr>
-        <w:spacing w:after="30"/>
-      </w:pPr>
-      <w:r>
-        <w:rPr>
-          <w:rFonts w:ascii="Times New Roman" w:cs="Times New Roman" w:eastAsia="Times New Roman" w:hAnsi="Times New Roman"/>
-          <w:sz w:val="22"/>
-          <w:szCs w:val="22"/>
-        </w:rPr>
-        <w:t xml:space="preserve">Strong proficiency in Excel/Google Sheets; familiarity with Tally, GST, and no-code/low-code tools is a plus</w:t>
+        <w:t xml:space="preserve">Ability to break a messy, manual process into clear steps, rules, and owners</w:t>
+      </w:r>
+    </w:p>
+    <w:p>
+      <w:pPr>
+        <w:pStyle w:val="ListParagraph"/>
+        <w:numPr>
+          <w:ilvl w:val="0"/>
+          <w:numId w:val="2"/>
+        </w:numPr>
+        <w:spacing w:after="30"/>
+      </w:pPr>
+      <w:r>
+        <w:rPr>
+          <w:rFonts w:ascii="Times New Roman" w:cs="Times New Roman" w:eastAsia="Times New Roman" w:hAnsi="Times New Roman"/>
+          <w:sz w:val="22"/>
+          <w:szCs w:val="22"/>
+        </w:rPr>
+        <w:t xml:space="preserve">Hands-on with building simple tools in spreadsheets, no-code platforms, or basic scripting (Apps Script, HTML/JS)</w:t>
+      </w:r>
+    </w:p>
+    <w:p>
+      <w:pPr>
+        <w:pStyle w:val="ListParagraph"/>
+        <w:numPr>
+          <w:ilvl w:val="0"/>
+          <w:numId w:val="2"/>
+        </w:numPr>
+        <w:spacing w:after="30"/>
+      </w:pPr>
+      <w:r>
+        <w:rPr>
+          <w:rFonts w:ascii="Times New Roman" w:cs="Times New Roman" w:eastAsia="Times New Roman" w:hAnsi="Times New Roman"/>
+          <w:sz w:val="22"/>
+          <w:szCs w:val="22"/>
+        </w:rPr>
+        <w:t xml:space="preserve">Process mapping and SOP writing that people can follow without hand-holding</w:t>
+      </w:r>
+    </w:p>
+    <w:p>
+      <w:pPr>
+        <w:pStyle w:val="ListParagraph"/>
+        <w:numPr>
+          <w:ilvl w:val="0"/>
+          <w:numId w:val="2"/>
+        </w:numPr>
+        <w:spacing w:after="30"/>
+      </w:pPr>
+      <w:r>
+        <w:rPr>
+          <w:rFonts w:ascii="Times New Roman" w:cs="Times New Roman" w:eastAsia="Times New Roman" w:hAnsi="Times New Roman"/>
+          <w:sz w:val="22"/>
+          <w:szCs w:val="22"/>
+        </w:rPr>
+        <w:t xml:space="preserve">A numbers-first mindset: quantifying cost, time saved, and margin impact before recommending a change</w:t>
       </w:r>
     </w:p>
     <w:p>
@@ -551,7 +569,7 @@
           <w:sz w:val="22"/>
           <w:szCs w:val="22"/>
         </w:rPr>
-        <w:t xml:space="preserve">Clear written and verbal communication, with the ability to present findings to senior leadership</w:t>
+        <w:t xml:space="preserve">Ownership: takes work from idea to adoption with minimal supervision</w:t>
       </w:r>
     </w:p>
     <w:sectPr>

</xml_diff>